<commit_message>
Sync handover doc: split items into รายการอุปกรณ์/รายการเพิ่มเติม, two-line letterhead; v1.20.4
- Delivered-items table on the handover PDF now splits into goods
  ("รายการอุปกรณ์") and services ("รายการเพิ่มเติม", shown only when the job
  has one) instead of one merged table; a service row shows just its Part
  code, never the ซัพพลายเออร์ next to it.
- Letterhead's ที่อยู่บริษัท / เลขประจำตัวผู้เสียภาษี now print as two separate
  lines, matching the reference Word template after the user's latest edit
  to it. docs/handover-template.docx replaced with that edited copy.

Co-Authored-By: Claude Sonnet 5 <noreply@anthropic.com>
</commit_message>
<xml_diff>
--- a/docs/handover-template.docx
+++ b/docs/handover-template.docx
@@ -7,6 +7,7 @@
         <w:spacing w:before="120" w:after="0" w:line="560" w:lineRule="exact"/>
         <w:jc w:val="center"/>
       </w:pPr>
+      <w:proofErr w:type="spellStart"/>
       <w:r>
         <w:rPr>
           <w:b/>
@@ -17,6 +18,7 @@
         </w:rPr>
         <w:t>เอกสารส่งมอบงาน</w:t>
       </w:r>
+      <w:proofErr w:type="spellEnd"/>
     </w:p>
     <w:p>
       <w:pPr>
@@ -47,6 +49,7 @@
         </w:rPr>
         <w:t xml:space="preserve">1.  </w:t>
       </w:r>
+      <w:proofErr w:type="spellStart"/>
       <w:r>
         <w:rPr>
           <w:b/>
@@ -57,6 +60,7 @@
         </w:rPr>
         <w:t>ข้อมูลทั่วไป</w:t>
       </w:r>
+      <w:proofErr w:type="spellEnd"/>
     </w:p>
     <w:tbl>
       <w:tblPr>
@@ -96,6 +100,7 @@
             <w:pPr>
               <w:spacing w:after="0" w:line="300" w:lineRule="exact"/>
             </w:pPr>
+            <w:proofErr w:type="spellStart"/>
             <w:r>
               <w:rPr>
                 <w:b/>
@@ -106,6 +111,7 @@
               </w:rPr>
               <w:t>เลข</w:t>
             </w:r>
+            <w:proofErr w:type="spellEnd"/>
             <w:r>
               <w:rPr>
                 <w:b/>
@@ -117,6 +123,7 @@
               </w:rPr>
               <w:t>ที่</w:t>
             </w:r>
+            <w:proofErr w:type="spellStart"/>
             <w:r>
               <w:rPr>
                 <w:b/>
@@ -127,6 +134,7 @@
               </w:rPr>
               <w:t>เอกสาร</w:t>
             </w:r>
+            <w:proofErr w:type="spellEnd"/>
           </w:p>
         </w:tc>
         <w:tc>
@@ -156,7 +164,25 @@
                 <w:sz w:val="30"/>
                 <w:szCs w:val="30"/>
               </w:rPr>
-              <w:t>[เลขที่เอกสาร]</w:t>
+              <w:t>[</w:t>
+            </w:r>
+            <w:proofErr w:type="spellStart"/>
+            <w:r>
+              <w:rPr>
+                <w:color w:val="8A8A8A"/>
+                <w:sz w:val="30"/>
+                <w:szCs w:val="30"/>
+              </w:rPr>
+              <w:t>เลขที่เอกสาร</w:t>
+            </w:r>
+            <w:proofErr w:type="spellEnd"/>
+            <w:r>
+              <w:rPr>
+                <w:color w:val="8A8A8A"/>
+                <w:sz w:val="30"/>
+                <w:szCs w:val="30"/>
+              </w:rPr>
+              <w:t>]</w:t>
             </w:r>
           </w:p>
         </w:tc>
@@ -182,6 +208,7 @@
             <w:pPr>
               <w:spacing w:after="0" w:line="300" w:lineRule="exact"/>
             </w:pPr>
+            <w:proofErr w:type="spellStart"/>
             <w:r>
               <w:rPr>
                 <w:b/>
@@ -192,6 +219,7 @@
               </w:rPr>
               <w:t>วันที่ส่งมอบ</w:t>
             </w:r>
+            <w:proofErr w:type="spellEnd"/>
           </w:p>
         </w:tc>
         <w:tc>
@@ -222,8 +250,18 @@
                 <w:sz w:val="30"/>
                 <w:szCs w:val="30"/>
               </w:rPr>
-              <w:t>[วัน</w:t>
-            </w:r>
+              <w:t>[</w:t>
+            </w:r>
+            <w:proofErr w:type="spellStart"/>
+            <w:r>
+              <w:rPr>
+                <w:color w:val="8A8A8A"/>
+                <w:sz w:val="30"/>
+                <w:szCs w:val="30"/>
+              </w:rPr>
+              <w:t>วัน</w:t>
+            </w:r>
+            <w:proofErr w:type="spellEnd"/>
             <w:r>
               <w:rPr>
                 <w:rFonts w:hint="cs"/>
@@ -271,6 +309,7 @@
             <w:pPr>
               <w:spacing w:after="0" w:line="300" w:lineRule="exact"/>
             </w:pPr>
+            <w:proofErr w:type="spellStart"/>
             <w:r>
               <w:rPr>
                 <w:b/>
@@ -281,6 +320,7 @@
               </w:rPr>
               <w:t>ชื่อโครงการ</w:t>
             </w:r>
+            <w:proofErr w:type="spellEnd"/>
           </w:p>
         </w:tc>
         <w:tc>
@@ -351,6 +391,7 @@
             <w:pPr>
               <w:spacing w:after="0" w:line="300" w:lineRule="exact"/>
             </w:pPr>
+            <w:proofErr w:type="spellStart"/>
             <w:r>
               <w:rPr>
                 <w:b/>
@@ -361,6 +402,7 @@
               </w:rPr>
               <w:t>เลขที่สัญญา</w:t>
             </w:r>
+            <w:proofErr w:type="spellEnd"/>
           </w:p>
         </w:tc>
         <w:tc>
@@ -390,7 +432,25 @@
                 <w:sz w:val="30"/>
                 <w:szCs w:val="30"/>
               </w:rPr>
-              <w:t>[ระบุเลขที่สัญญา]</w:t>
+              <w:t>[</w:t>
+            </w:r>
+            <w:proofErr w:type="spellStart"/>
+            <w:r>
+              <w:rPr>
+                <w:color w:val="8A8A8A"/>
+                <w:sz w:val="30"/>
+                <w:szCs w:val="30"/>
+              </w:rPr>
+              <w:t>ระบุเลขที่สัญญา</w:t>
+            </w:r>
+            <w:proofErr w:type="spellEnd"/>
+            <w:r>
+              <w:rPr>
+                <w:color w:val="8A8A8A"/>
+                <w:sz w:val="30"/>
+                <w:szCs w:val="30"/>
+              </w:rPr>
+              <w:t>]</w:t>
             </w:r>
           </w:p>
         </w:tc>
@@ -416,6 +476,7 @@
             <w:pPr>
               <w:spacing w:after="0" w:line="300" w:lineRule="exact"/>
             </w:pPr>
+            <w:proofErr w:type="spellStart"/>
             <w:r>
               <w:rPr>
                 <w:b/>
@@ -426,6 +487,7 @@
               </w:rPr>
               <w:t>งวดงานที่</w:t>
             </w:r>
+            <w:proofErr w:type="spellEnd"/>
           </w:p>
         </w:tc>
         <w:tc>
@@ -455,7 +517,25 @@
                 <w:sz w:val="30"/>
                 <w:szCs w:val="30"/>
               </w:rPr>
-              <w:t>[ระบุงวดงาน]</w:t>
+              <w:t>[</w:t>
+            </w:r>
+            <w:proofErr w:type="spellStart"/>
+            <w:r>
+              <w:rPr>
+                <w:color w:val="8A8A8A"/>
+                <w:sz w:val="30"/>
+                <w:szCs w:val="30"/>
+              </w:rPr>
+              <w:t>ระบุงวดงาน</w:t>
+            </w:r>
+            <w:proofErr w:type="spellEnd"/>
+            <w:r>
+              <w:rPr>
+                <w:color w:val="8A8A8A"/>
+                <w:sz w:val="30"/>
+                <w:szCs w:val="30"/>
+              </w:rPr>
+              <w:t>]</w:t>
             </w:r>
           </w:p>
         </w:tc>
@@ -486,6 +566,7 @@
             <w:pPr>
               <w:spacing w:after="0" w:line="300" w:lineRule="exact"/>
             </w:pPr>
+            <w:proofErr w:type="spellStart"/>
             <w:r>
               <w:rPr>
                 <w:b/>
@@ -494,8 +575,31 @@
                 <w:sz w:val="30"/>
                 <w:szCs w:val="30"/>
               </w:rPr>
-              <w:t>หน่วยงาน / บริษัท</w:t>
-            </w:r>
+              <w:t>หน่วยงาน</w:t>
+            </w:r>
+            <w:proofErr w:type="spellEnd"/>
+            <w:r>
+              <w:rPr>
+                <w:b/>
+                <w:bCs/>
+                <w:color w:val="1F3A5F"/>
+                <w:sz w:val="30"/>
+                <w:szCs w:val="30"/>
+              </w:rPr>
+              <w:t xml:space="preserve"> / </w:t>
+            </w:r>
+            <w:proofErr w:type="spellStart"/>
+            <w:r>
+              <w:rPr>
+                <w:b/>
+                <w:bCs/>
+                <w:color w:val="1F3A5F"/>
+                <w:sz w:val="30"/>
+                <w:szCs w:val="30"/>
+              </w:rPr>
+              <w:t>บริษัท</w:t>
+            </w:r>
+            <w:proofErr w:type="spellEnd"/>
           </w:p>
         </w:tc>
         <w:tc>
@@ -641,7 +745,6 @@
             <w:pPr>
               <w:spacing w:after="0" w:line="300" w:lineRule="exact"/>
               <w:rPr>
-                <w:rFonts w:hint="cs"/>
                 <w:cs/>
               </w:rPr>
             </w:pPr>
@@ -737,6 +840,7 @@
             <w:pPr>
               <w:spacing w:after="0" w:line="300" w:lineRule="exact"/>
             </w:pPr>
+            <w:proofErr w:type="spellStart"/>
             <w:r>
               <w:rPr>
                 <w:b/>
@@ -747,6 +851,7 @@
               </w:rPr>
               <w:t>สถานที่ส่งมอบ</w:t>
             </w:r>
+            <w:proofErr w:type="spellEnd"/>
           </w:p>
         </w:tc>
         <w:tc>
@@ -776,7 +881,25 @@
                 <w:sz w:val="30"/>
                 <w:szCs w:val="30"/>
               </w:rPr>
-              <w:t>[ระบุสถานที่]</w:t>
+              <w:t>[</w:t>
+            </w:r>
+            <w:proofErr w:type="spellStart"/>
+            <w:r>
+              <w:rPr>
+                <w:color w:val="8A8A8A"/>
+                <w:sz w:val="30"/>
+                <w:szCs w:val="30"/>
+              </w:rPr>
+              <w:t>ระบุสถานที่</w:t>
+            </w:r>
+            <w:proofErr w:type="spellEnd"/>
+            <w:r>
+              <w:rPr>
+                <w:color w:val="8A8A8A"/>
+                <w:sz w:val="30"/>
+                <w:szCs w:val="30"/>
+              </w:rPr>
+              <w:t>]</w:t>
             </w:r>
           </w:p>
         </w:tc>
@@ -802,6 +925,7 @@
             <w:pPr>
               <w:spacing w:after="0" w:line="300" w:lineRule="exact"/>
             </w:pPr>
+            <w:proofErr w:type="spellStart"/>
             <w:r>
               <w:rPr>
                 <w:b/>
@@ -812,6 +936,7 @@
               </w:rPr>
               <w:t>ช่องทางติดต่อ</w:t>
             </w:r>
+            <w:proofErr w:type="spellEnd"/>
           </w:p>
         </w:tc>
         <w:tc>
@@ -876,6 +1001,7 @@
         </w:rPr>
         <w:t xml:space="preserve">2.  </w:t>
       </w:r>
+      <w:proofErr w:type="spellStart"/>
       <w:r>
         <w:rPr>
           <w:b/>
@@ -886,6 +1012,7 @@
         </w:rPr>
         <w:t>รายการงานที่ส่งมอบ</w:t>
       </w:r>
+      <w:proofErr w:type="spellEnd"/>
     </w:p>
     <w:tbl>
       <w:tblPr>
@@ -969,7 +1096,6 @@
               <w:spacing w:after="0" w:line="300" w:lineRule="exact"/>
               <w:jc w:val="center"/>
               <w:rPr>
-                <w:rFonts w:hint="cs"/>
                 <w:b/>
                 <w:bCs/>
                 <w:sz w:val="30"/>
@@ -1036,7 +1162,6 @@
               <w:spacing w:after="0" w:line="300" w:lineRule="exact"/>
               <w:jc w:val="center"/>
               <w:rPr>
-                <w:rFonts w:hint="cs"/>
                 <w:b/>
                 <w:bCs/>
                 <w:sz w:val="30"/>
@@ -1080,7 +1205,6 @@
               <w:spacing w:after="0" w:line="300" w:lineRule="exact"/>
               <w:jc w:val="center"/>
               <w:rPr>
-                <w:rFonts w:hint="cs"/>
                 <w:b/>
                 <w:bCs/>
                 <w:sz w:val="30"/>
@@ -1143,6 +1267,7 @@
                 <w:szCs w:val="30"/>
               </w:rPr>
             </w:pPr>
+            <w:proofErr w:type="spellStart"/>
             <w:r>
               <w:rPr>
                 <w:b/>
@@ -1153,6 +1278,7 @@
               </w:rPr>
               <w:t>จำนวน</w:t>
             </w:r>
+            <w:proofErr w:type="spellEnd"/>
           </w:p>
         </w:tc>
       </w:tr>
@@ -1249,23 +1375,7 @@
                 <w:sz w:val="28"/>
                 <w:szCs w:val="28"/>
               </w:rPr>
-              <w:t>[Part]</w:t>
-            </w:r>
-            <w:r>
-              <w:rPr>
-                <w:color w:val="262626" w:themeColor="text1" w:themeTint="D9"/>
-                <w:sz w:val="28"/>
-                <w:szCs w:val="28"/>
-              </w:rPr>
-              <w:t xml:space="preserve"> / </w:t>
-            </w:r>
-            <w:r>
-              <w:rPr>
-                <w:color w:val="262626" w:themeColor="text1" w:themeTint="D9"/>
-                <w:sz w:val="28"/>
-                <w:szCs w:val="28"/>
-              </w:rPr>
-              <w:t>[</w:t>
+              <w:t>[Part] / [</w:t>
             </w:r>
             <w:r>
               <w:rPr>
@@ -4318,6 +4428,7 @@
         </w:rPr>
         <w:t xml:space="preserve">.  </w:t>
       </w:r>
+      <w:proofErr w:type="spellStart"/>
       <w:r>
         <w:rPr>
           <w:b/>
@@ -4328,6 +4439,7 @@
         </w:rPr>
         <w:t>ผลการตรวจรับงาน</w:t>
       </w:r>
+      <w:proofErr w:type="spellEnd"/>
     </w:p>
     <w:p>
       <w:pPr>
@@ -4347,8 +4459,32 @@
         <w:rPr>
           <w:color w:val="000000"/>
         </w:rPr>
-        <w:t xml:space="preserve">   ครบถ้วนถูกต้อง  รับมอบงานทั้งหมดตามรายการข้างต้น</w:t>
+        <w:t xml:space="preserve">   </w:t>
       </w:r>
+      <w:proofErr w:type="spellStart"/>
+      <w:proofErr w:type="gramStart"/>
+      <w:r>
+        <w:rPr>
+          <w:color w:val="000000"/>
+        </w:rPr>
+        <w:t>ครบถ้วนถูกต้อง</w:t>
+      </w:r>
+      <w:proofErr w:type="spellEnd"/>
+      <w:r>
+        <w:rPr>
+          <w:color w:val="000000"/>
+        </w:rPr>
+        <w:t xml:space="preserve">  </w:t>
+      </w:r>
+      <w:proofErr w:type="spellStart"/>
+      <w:r>
+        <w:rPr>
+          <w:color w:val="000000"/>
+        </w:rPr>
+        <w:t>รับมอบงานทั้งหมดตามรายการข้างต้น</w:t>
+      </w:r>
+      <w:proofErr w:type="spellEnd"/>
+      <w:proofErr w:type="gramEnd"/>
     </w:p>
     <w:p>
       <w:pPr>
@@ -4368,8 +4504,32 @@
         <w:rPr>
           <w:color w:val="000000"/>
         </w:rPr>
-        <w:t xml:space="preserve">   รับมอบแบบมีเงื่อนไข  โดยต้องแก้ไขตามหมายเหตุด้านล่าง</w:t>
+        <w:t xml:space="preserve">   </w:t>
       </w:r>
+      <w:proofErr w:type="spellStart"/>
+      <w:proofErr w:type="gramStart"/>
+      <w:r>
+        <w:rPr>
+          <w:color w:val="000000"/>
+        </w:rPr>
+        <w:t>รับมอบแบบมีเงื่อนไข</w:t>
+      </w:r>
+      <w:proofErr w:type="spellEnd"/>
+      <w:r>
+        <w:rPr>
+          <w:color w:val="000000"/>
+        </w:rPr>
+        <w:t xml:space="preserve">  </w:t>
+      </w:r>
+      <w:proofErr w:type="spellStart"/>
+      <w:r>
+        <w:rPr>
+          <w:color w:val="000000"/>
+        </w:rPr>
+        <w:t>โดยต้องแก้ไขตามหมายเหตุด้านล่าง</w:t>
+      </w:r>
+      <w:proofErr w:type="spellEnd"/>
+      <w:proofErr w:type="gramEnd"/>
     </w:p>
     <w:p>
       <w:pPr>
@@ -4389,14 +4549,39 @@
         <w:rPr>
           <w:color w:val="000000"/>
         </w:rPr>
-        <w:t xml:space="preserve">   ไม่รับมอบงาน  เนื่องจากไม่เป็นไปตามข้อกำหนด</w:t>
+        <w:t xml:space="preserve">   </w:t>
       </w:r>
+      <w:proofErr w:type="spellStart"/>
+      <w:proofErr w:type="gramStart"/>
+      <w:r>
+        <w:rPr>
+          <w:color w:val="000000"/>
+        </w:rPr>
+        <w:t>ไม่รับมอบงาน</w:t>
+      </w:r>
+      <w:proofErr w:type="spellEnd"/>
+      <w:r>
+        <w:rPr>
+          <w:color w:val="000000"/>
+        </w:rPr>
+        <w:t xml:space="preserve">  </w:t>
+      </w:r>
+      <w:proofErr w:type="spellStart"/>
+      <w:r>
+        <w:rPr>
+          <w:color w:val="000000"/>
+        </w:rPr>
+        <w:t>เนื่องจากไม่เป็นไปตามข้อกำหนด</w:t>
+      </w:r>
+      <w:proofErr w:type="spellEnd"/>
+      <w:proofErr w:type="gramEnd"/>
     </w:p>
     <w:p>
       <w:pPr>
         <w:spacing w:before="100" w:after="20" w:line="300" w:lineRule="exact"/>
         <w:ind w:left="360"/>
       </w:pPr>
+      <w:proofErr w:type="spellStart"/>
       <w:r>
         <w:rPr>
           <w:b/>
@@ -4405,8 +4590,31 @@
           <w:sz w:val="30"/>
           <w:szCs w:val="30"/>
         </w:rPr>
-        <w:t>หมายเหตุ / ข้อเสนอแนะ</w:t>
+        <w:t>หมายเหตุ</w:t>
       </w:r>
+      <w:proofErr w:type="spellEnd"/>
+      <w:r>
+        <w:rPr>
+          <w:b/>
+          <w:bCs/>
+          <w:color w:val="1F3A5F"/>
+          <w:sz w:val="30"/>
+          <w:szCs w:val="30"/>
+        </w:rPr>
+        <w:t xml:space="preserve"> / </w:t>
+      </w:r>
+      <w:proofErr w:type="spellStart"/>
+      <w:r>
+        <w:rPr>
+          <w:b/>
+          <w:bCs/>
+          <w:color w:val="1F3A5F"/>
+          <w:sz w:val="30"/>
+          <w:szCs w:val="30"/>
+        </w:rPr>
+        <w:t>ข้อเสนอแนะ</w:t>
+      </w:r>
+      <w:proofErr w:type="spellEnd"/>
     </w:p>
     <w:p>
       <w:pPr>
@@ -4433,7 +4641,6 @@
         <w:spacing w:before="280" w:after="120" w:line="340" w:lineRule="exact"/>
         <w:ind w:left="140"/>
         <w:rPr>
-          <w:rFonts w:hint="cs"/>
           <w:cs/>
         </w:rPr>
       </w:pPr>
@@ -4475,7 +4682,6 @@
         <w:spacing w:after="40" w:line="300" w:lineRule="exact"/>
         <w:ind w:left="360"/>
         <w:rPr>
-          <w:rFonts w:hint="cs"/>
           <w:cs/>
         </w:rPr>
       </w:pPr>
@@ -4506,9 +4712,6 @@
       <w:pPr>
         <w:spacing w:after="40" w:line="300" w:lineRule="exact"/>
         <w:ind w:left="360"/>
-        <w:rPr>
-          <w:rFonts w:hint="cs"/>
-        </w:rPr>
       </w:pPr>
       <w:r>
         <w:rPr>
@@ -4538,9 +4741,6 @@
       <w:pPr>
         <w:spacing w:after="40" w:line="300" w:lineRule="exact"/>
         <w:ind w:left="360"/>
-        <w:rPr>
-          <w:rFonts w:hint="cs"/>
-        </w:rPr>
       </w:pPr>
       <w:r>
         <w:rPr>
@@ -4577,6 +4777,7 @@
         <w:spacing w:before="100" w:after="20" w:line="300" w:lineRule="exact"/>
         <w:ind w:left="360"/>
       </w:pPr>
+      <w:proofErr w:type="spellStart"/>
       <w:r>
         <w:rPr>
           <w:b/>
@@ -4585,8 +4786,31 @@
           <w:sz w:val="30"/>
           <w:szCs w:val="30"/>
         </w:rPr>
-        <w:t>หมายเหตุ / ข้อเสนอแนะ</w:t>
+        <w:t>หมายเหตุ</w:t>
       </w:r>
+      <w:proofErr w:type="spellEnd"/>
+      <w:r>
+        <w:rPr>
+          <w:b/>
+          <w:bCs/>
+          <w:color w:val="1F3A5F"/>
+          <w:sz w:val="30"/>
+          <w:szCs w:val="30"/>
+        </w:rPr>
+        <w:t xml:space="preserve"> / </w:t>
+      </w:r>
+      <w:proofErr w:type="spellStart"/>
+      <w:r>
+        <w:rPr>
+          <w:b/>
+          <w:bCs/>
+          <w:color w:val="1F3A5F"/>
+          <w:sz w:val="30"/>
+          <w:szCs w:val="30"/>
+        </w:rPr>
+        <w:t>ข้อเสนอแนะ</w:t>
+      </w:r>
+      <w:proofErr w:type="spellEnd"/>
     </w:p>
     <w:p>
       <w:pPr>
@@ -4642,6 +4866,7 @@
         </w:rPr>
         <w:t xml:space="preserve">.  </w:t>
       </w:r>
+      <w:proofErr w:type="spellStart"/>
       <w:r>
         <w:rPr>
           <w:b/>
@@ -4652,6 +4877,7 @@
         </w:rPr>
         <w:t>ลงนามรับรอง</w:t>
       </w:r>
+      <w:proofErr w:type="spellEnd"/>
     </w:p>
     <w:p>
       <w:pPr>
@@ -4659,12 +4885,28 @@
         <w:spacing w:after="160" w:line="300" w:lineRule="exact"/>
         <w:ind w:firstLine="720"/>
       </w:pPr>
+      <w:proofErr w:type="spellStart"/>
       <w:r>
         <w:rPr>
           <w:color w:val="595959"/>
         </w:rPr>
-        <w:t>คู่สัญญาได้อ่านและเข้าใจข้อความในเอกสารฉบับนี้โดยตลอดแล้ว จึงลงลายมือชื่อไว้เป็นหลักฐาน</w:t>
+        <w:t>คู่สัญญาได้อ่านและเข้าใจข้อความในเอกสารฉบับนี้โดยตลอดแล้ว</w:t>
       </w:r>
+      <w:proofErr w:type="spellEnd"/>
+      <w:r>
+        <w:rPr>
+          <w:color w:val="595959"/>
+        </w:rPr>
+        <w:t xml:space="preserve"> </w:t>
+      </w:r>
+      <w:proofErr w:type="spellStart"/>
+      <w:r>
+        <w:rPr>
+          <w:color w:val="595959"/>
+        </w:rPr>
+        <w:t>จึงลงลายมือชื่อไว้เป็นหลักฐาน</w:t>
+      </w:r>
+      <w:proofErr w:type="spellEnd"/>
     </w:p>
     <w:tbl>
       <w:tblPr>
@@ -4703,6 +4945,7 @@
               <w:spacing w:before="160" w:after="520" w:line="320" w:lineRule="exact"/>
               <w:jc w:val="center"/>
             </w:pPr>
+            <w:proofErr w:type="spellStart"/>
             <w:r>
               <w:rPr>
                 <w:b/>
@@ -4711,6 +4954,7 @@
               </w:rPr>
               <w:t>ผู้ส่งมอบงาน</w:t>
             </w:r>
+            <w:proofErr w:type="spellEnd"/>
           </w:p>
           <w:p>
             <w:pPr>
@@ -4718,13 +4962,23 @@
               <w:spacing w:after="20" w:line="300" w:lineRule="exact"/>
               <w:jc w:val="center"/>
             </w:pPr>
+            <w:proofErr w:type="spellStart"/>
             <w:r>
               <w:rPr>
                 <w:color w:val="000000"/>
                 <w:sz w:val="30"/>
                 <w:szCs w:val="30"/>
               </w:rPr>
-              <w:t>ลงชื่อ ..................................</w:t>
+              <w:t>ลงชื่อ</w:t>
+            </w:r>
+            <w:proofErr w:type="spellEnd"/>
+            <w:r>
+              <w:rPr>
+                <w:color w:val="000000"/>
+                <w:sz w:val="30"/>
+                <w:szCs w:val="30"/>
+              </w:rPr>
+              <w:t xml:space="preserve"> ..................................</w:t>
             </w:r>
           </w:p>
           <w:p>
@@ -4748,13 +5002,23 @@
               <w:spacing w:after="20" w:line="300" w:lineRule="exact"/>
               <w:jc w:val="center"/>
             </w:pPr>
+            <w:proofErr w:type="spellStart"/>
             <w:r>
               <w:rPr>
                 <w:color w:val="000000"/>
                 <w:sz w:val="30"/>
                 <w:szCs w:val="30"/>
               </w:rPr>
-              <w:t>ตำแหน่ง ..............................</w:t>
+              <w:t>ตำแหน่ง</w:t>
+            </w:r>
+            <w:proofErr w:type="spellEnd"/>
+            <w:r>
+              <w:rPr>
+                <w:color w:val="000000"/>
+                <w:sz w:val="30"/>
+                <w:szCs w:val="30"/>
+              </w:rPr>
+              <w:t xml:space="preserve"> ..............................</w:t>
             </w:r>
           </w:p>
           <w:p>
@@ -4762,13 +5026,23 @@
               <w:spacing w:after="20" w:line="300" w:lineRule="exact"/>
               <w:jc w:val="center"/>
             </w:pPr>
+            <w:proofErr w:type="spellStart"/>
             <w:r>
               <w:rPr>
                 <w:color w:val="000000"/>
                 <w:sz w:val="30"/>
                 <w:szCs w:val="30"/>
               </w:rPr>
-              <w:t>วันที่ ............ / ............ / ............</w:t>
+              <w:t>วันที่</w:t>
+            </w:r>
+            <w:proofErr w:type="spellEnd"/>
+            <w:r>
+              <w:rPr>
+                <w:color w:val="000000"/>
+                <w:sz w:val="30"/>
+                <w:szCs w:val="30"/>
+              </w:rPr>
+              <w:t xml:space="preserve"> ............ / ............ / ............</w:t>
             </w:r>
           </w:p>
         </w:tc>
@@ -4795,6 +5069,7 @@
               <w:spacing w:before="160" w:after="520" w:line="320" w:lineRule="exact"/>
               <w:jc w:val="center"/>
             </w:pPr>
+            <w:proofErr w:type="spellStart"/>
             <w:r>
               <w:rPr>
                 <w:b/>
@@ -4803,6 +5078,7 @@
               </w:rPr>
               <w:t>ผู้รับมอบงาน</w:t>
             </w:r>
+            <w:proofErr w:type="spellEnd"/>
           </w:p>
           <w:p>
             <w:pPr>
@@ -4810,13 +5086,23 @@
               <w:spacing w:after="20" w:line="300" w:lineRule="exact"/>
               <w:jc w:val="center"/>
             </w:pPr>
+            <w:proofErr w:type="spellStart"/>
             <w:r>
               <w:rPr>
                 <w:color w:val="000000"/>
                 <w:sz w:val="30"/>
                 <w:szCs w:val="30"/>
               </w:rPr>
-              <w:t>ลงชื่อ ..................................</w:t>
+              <w:t>ลงชื่อ</w:t>
+            </w:r>
+            <w:proofErr w:type="spellEnd"/>
+            <w:r>
+              <w:rPr>
+                <w:color w:val="000000"/>
+                <w:sz w:val="30"/>
+                <w:szCs w:val="30"/>
+              </w:rPr>
+              <w:t xml:space="preserve"> ..................................</w:t>
             </w:r>
           </w:p>
           <w:p>
@@ -4840,13 +5126,23 @@
               <w:spacing w:after="20" w:line="300" w:lineRule="exact"/>
               <w:jc w:val="center"/>
             </w:pPr>
+            <w:proofErr w:type="spellStart"/>
             <w:r>
               <w:rPr>
                 <w:color w:val="000000"/>
                 <w:sz w:val="30"/>
                 <w:szCs w:val="30"/>
               </w:rPr>
-              <w:t>ตำแหน่ง ..............................</w:t>
+              <w:t>ตำแหน่ง</w:t>
+            </w:r>
+            <w:proofErr w:type="spellEnd"/>
+            <w:r>
+              <w:rPr>
+                <w:color w:val="000000"/>
+                <w:sz w:val="30"/>
+                <w:szCs w:val="30"/>
+              </w:rPr>
+              <w:t xml:space="preserve"> ..............................</w:t>
             </w:r>
           </w:p>
           <w:p>
@@ -4854,13 +5150,23 @@
               <w:spacing w:after="20" w:line="300" w:lineRule="exact"/>
               <w:jc w:val="center"/>
             </w:pPr>
+            <w:proofErr w:type="spellStart"/>
             <w:r>
               <w:rPr>
                 <w:color w:val="000000"/>
                 <w:sz w:val="30"/>
                 <w:szCs w:val="30"/>
               </w:rPr>
-              <w:t>วันที่ ............ / ............ / ............</w:t>
+              <w:t>วันที่</w:t>
+            </w:r>
+            <w:proofErr w:type="spellEnd"/>
+            <w:r>
+              <w:rPr>
+                <w:color w:val="000000"/>
+                <w:sz w:val="30"/>
+                <w:szCs w:val="30"/>
+              </w:rPr>
+              <w:t xml:space="preserve"> ............ / ............ / ............</w:t>
             </w:r>
           </w:p>
         </w:tc>
@@ -4869,7 +5175,6 @@
     <w:p>
       <w:pPr>
         <w:rPr>
-          <w:rFonts w:hint="cs"/>
           <w:cs/>
         </w:rPr>
       </w:pPr>
@@ -4923,22 +5228,59 @@
       </w:tabs>
       <w:spacing w:after="0" w:line="260" w:lineRule="exact"/>
     </w:pPr>
+    <w:proofErr w:type="spellStart"/>
     <w:r>
       <w:rPr>
         <w:color w:val="595959"/>
         <w:sz w:val="24"/>
         <w:szCs w:val="24"/>
       </w:rPr>
-      <w:t>เอกสารฉบับนี้จัดทำขึ้นเป็นสองฉบับ มีข้อความถูกต้องตรงกัน</w:t>
+      <w:t>เอกสารฉบับนี้จัดทำขึ้นเป็นสองฉบับ</w:t>
     </w:r>
+    <w:proofErr w:type="spellEnd"/>
     <w:r>
       <w:rPr>
         <w:color w:val="595959"/>
         <w:sz w:val="24"/>
         <w:szCs w:val="24"/>
       </w:rPr>
+      <w:t xml:space="preserve"> </w:t>
+    </w:r>
+    <w:proofErr w:type="spellStart"/>
+    <w:r>
+      <w:rPr>
+        <w:color w:val="595959"/>
+        <w:sz w:val="24"/>
+        <w:szCs w:val="24"/>
+      </w:rPr>
+      <w:t>มีข้อความถูกต้องตรงกัน</w:t>
+    </w:r>
+    <w:proofErr w:type="spellEnd"/>
+    <w:r>
+      <w:rPr>
+        <w:color w:val="595959"/>
+        <w:sz w:val="24"/>
+        <w:szCs w:val="24"/>
+      </w:rPr>
       <w:tab/>
-      <w:t xml:space="preserve">หน้า </w:t>
+    </w:r>
+    <w:proofErr w:type="spellStart"/>
+    <w:r>
+      <w:rPr>
+        <w:color w:val="595959"/>
+        <w:sz w:val="24"/>
+        <w:szCs w:val="24"/>
+      </w:rPr>
+      <w:t>หน้า</w:t>
+    </w:r>
+    <w:proofErr w:type="spellEnd"/>
+    <w:r>
+      <w:rPr>
+        <w:color w:val="595959"/>
+        <w:sz w:val="24"/>
+        <w:szCs w:val="24"/>
+      </w:rPr>
+      <w:t xml:space="preserve"> </w:t>
     </w:r>
     <w:r>
       <w:rPr>
@@ -5075,12 +5417,21 @@
     <w:r>
       <w:t>[</w:t>
     </w:r>
+    <w:proofErr w:type="spellStart"/>
     <w:r>
       <w:rPr>
         <w:rFonts w:hint="cs"/>
         <w:cs/>
       </w:rPr>
-      <w:t>โลโก้</w:t>
+      <w:t>โล</w:t>
+    </w:r>
+    <w:proofErr w:type="spellEnd"/>
+    <w:r>
+      <w:rPr>
+        <w:rFonts w:hint="cs"/>
+        <w:cs/>
+      </w:rPr>
+      <w:t>โก้</w:t>
     </w:r>
     <w:r>
       <w:t>]</w:t>
@@ -5160,6 +5511,19 @@
       </w:rPr>
       <w:t>]</w:t>
     </w:r>
+  </w:p>
+  <w:p>
+    <w:pPr>
+      <w:spacing w:after="0"/>
+      <w:jc w:val="right"/>
+      <w:rPr>
+        <w:rFonts w:ascii="TH SarabunPSK" w:hAnsi="TH SarabunPSK" w:cs="TH SarabunPSK"/>
+        <w:b/>
+        <w:bCs/>
+        <w:sz w:val="24"/>
+        <w:szCs w:val="24"/>
+      </w:rPr>
+    </w:pPr>
     <w:r>
       <w:rPr>
         <w:rFonts w:hint="cs"/>
@@ -5170,16 +5534,16 @@
       <mc:AlternateContent>
         <mc:Choice Requires="wps">
           <w:drawing>
-            <wp:anchor distT="0" distB="0" distL="114300" distR="114300" simplePos="0" relativeHeight="251676160" behindDoc="0" locked="0" layoutInCell="1" allowOverlap="1" wp14:anchorId="59149014" wp14:editId="218CF9CD">
+            <wp:anchor distT="0" distB="0" distL="114300" distR="114300" simplePos="0" relativeHeight="251676160" behindDoc="0" locked="0" layoutInCell="1" allowOverlap="1" wp14:anchorId="59149014" wp14:editId="4BD1A1F1">
               <wp:simplePos x="0" y="0"/>
               <wp:positionH relativeFrom="column">
                 <wp:posOffset>-229870</wp:posOffset>
               </wp:positionH>
               <wp:positionV relativeFrom="paragraph">
-                <wp:posOffset>281940</wp:posOffset>
+                <wp:posOffset>174935</wp:posOffset>
               </wp:positionV>
               <wp:extent cx="6271260" cy="0"/>
-              <wp:effectExtent l="8255" t="5715" r="6985" b="13335"/>
+              <wp:effectExtent l="0" t="0" r="0" b="0"/>
               <wp:wrapNone/>
               <wp:docPr id="671761426" name="Straight Arrow Connector 1"/>
               <wp:cNvGraphicFramePr>
@@ -5231,24 +5595,14 @@
         </mc:Choice>
         <mc:Fallback>
           <w:pict>
-            <v:shapetype w14:anchorId="211F70B9" id="_x0000_t32" coordsize="21600,21600" o:spt="32" o:oned="t" path="m,l21600,21600e" filled="f">
+            <v:shapetype w14:anchorId="4CEAE757" id="_x0000_t32" coordsize="21600,21600" o:spt="32" o:oned="t" path="m,l21600,21600e" filled="f">
               <v:path arrowok="t" fillok="f" o:connecttype="none"/>
               <o:lock v:ext="edit" shapetype="t"/>
             </v:shapetype>
-            <v:shape id="Straight Arrow Connector 1" o:spid="_x0000_s1026" type="#_x0000_t32" style="position:absolute;margin-left:-18.1pt;margin-top:22.2pt;width:493.8pt;height:0;z-index:251676160;visibility:visible;mso-wrap-style:square;mso-width-percent:0;mso-height-percent:0;mso-wrap-distance-left:9pt;mso-wrap-distance-top:0;mso-wrap-distance-right:9pt;mso-wrap-distance-bottom:0;mso-position-horizontal:absolute;mso-position-horizontal-relative:text;mso-position-vertical:absolute;mso-position-vertical-relative:text;mso-width-percent:0;mso-height-percent:0;mso-width-relative:page;mso-height-relative:page" o:gfxdata="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"/>
+            <v:shape id="Straight Arrow Connector 1" o:spid="_x0000_s1026" type="#_x0000_t32" style="position:absolute;margin-left:-18.1pt;margin-top:13.75pt;width:493.8pt;height:0;z-index:251676160;visibility:visible;mso-wrap-style:square;mso-width-percent:0;mso-height-percent:0;mso-wrap-distance-left:9pt;mso-wrap-distance-top:0;mso-wrap-distance-right:9pt;mso-wrap-distance-bottom:0;mso-position-horizontal:absolute;mso-position-horizontal-relative:text;mso-position-vertical:absolute;mso-position-vertical-relative:text;mso-width-percent:0;mso-height-percent:0;mso-width-relative:page;mso-height-relative:page" o:gfxdata="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"/>
           </w:pict>
         </mc:Fallback>
       </mc:AlternateContent>
-    </w:r>
-    <w:r>
-      <w:rPr>
-        <w:rFonts w:ascii="TH SarabunPSK" w:hAnsi="TH SarabunPSK" w:cs="TH SarabunPSK"/>
-        <w:b/>
-        <w:bCs/>
-        <w:sz w:val="24"/>
-        <w:szCs w:val="24"/>
-      </w:rPr>
-      <w:t xml:space="preserve"> /</w:t>
     </w:r>
     <w:r>
       <w:rPr>

</xml_diff>